<commit_message>
Split Week 1 resources into print-for-all core sheets + separate differentiation support sheets
Each lesson now has two files: a clean core worksheet with no tier boxes (safe to print and hand to every student) and a separate "Differentiation Support" sheet containing the Beginning-support and Above-extension content, clearly marked for teacher use to hand out selectively rather than exposing tiering to the whole class.
</commit_message>
<xml_diff>
--- a/resources/week-01/W1L1 - About Me & Goals Reflection.docx
+++ b/resources/week-01/W1L1 - About Me & Goals Reflection.docx
@@ -126,7 +126,7 @@
     </w:p>
     <w:p>
       <w:pPr>
-        <w:spacing w:after="400"/>
+        <w:spacing w:after="500"/>
       </w:pPr>
     </w:p>
     <w:p>
@@ -146,7 +146,7 @@
     </w:p>
     <w:p>
       <w:pPr>
-        <w:spacing w:after="400"/>
+        <w:spacing w:after="500"/>
       </w:pPr>
     </w:p>
     <w:p>
@@ -166,156 +166,9 @@
     </w:p>
     <w:p>
       <w:pPr>
-        <w:spacing w:after="400"/>
-      </w:pPr>
-    </w:p>
-    <w:tbl>
-      <w:tblPr>
-        <w:tblW w:type="pct" w:w="100%"/>
-        <w:tblBorders>
-          <w:top w:val="single" w:color="EE0000" w:sz="6"/>
-          <w:left w:val="single" w:color="EE0000" w:sz="6"/>
-          <w:bottom w:val="single" w:color="EE0000" w:sz="6"/>
-          <w:right w:val="single" w:color="EE0000" w:sz="6"/>
-          <w:insideH w:val="single" w:color="auto" w:sz="4"/>
-          <w:insideV w:val="single" w:color="auto" w:sz="4"/>
-        </w:tblBorders>
-      </w:tblPr>
-      <w:tblGrid>
-        <w:gridCol w:w="100"/>
-      </w:tblGrid>
-      <w:tr>
-        <w:tc>
-          <w:tcPr>
-            <w:shd w:fill="F2F2F2" w:color="auto" w:val="clear"/>
-            <w:tcMar>
-              <w:top w:type="dxa" w:w="120"/>
-              <w:left w:type="dxa" w:w="160"/>
-              <w:bottom w:type="dxa" w:w="120"/>
-              <w:right w:type="dxa" w:w="160"/>
-            </w:tcMar>
-          </w:tcPr>
-          <w:p>
-            <w:pPr>
-              <w:spacing w:after="80"/>
-            </w:pPr>
-            <w:r>
-              <w:rPr>
-                <w:rFonts w:ascii="Times New Roman" w:cs="Times New Roman" w:eastAsia="Times New Roman" w:hAnsi="Times New Roman"/>
-                <w:b/>
-                <w:bCs/>
-                <w:color w:val="EE0000"/>
-                <w:sz w:val="22"/>
-                <w:szCs w:val="22"/>
-              </w:rPr>
-              <w:t xml:space="preserve">Need a hand getting started? Try these sentence starters:</w:t>
-            </w:r>
-          </w:p>
-          <w:p>
-            <w:pPr>
-              <w:spacing w:after="60"/>
-            </w:pPr>
-            <w:r>
-              <w:rPr>
-                <w:rFonts w:ascii="Times New Roman" w:cs="Times New Roman" w:eastAsia="Times New Roman" w:hAnsi="Times New Roman"/>
-                <w:sz w:val="21"/>
-                <w:szCs w:val="21"/>
-              </w:rPr>
-              <w:t xml:space="preserve">"One thing I already know about technology is ____ because ____."</w:t>
-            </w:r>
-          </w:p>
-          <w:p>
-            <w:pPr>
-              <w:spacing w:after="60"/>
-            </w:pPr>
-            <w:r>
-              <w:rPr>
-                <w:rFonts w:ascii="Times New Roman" w:cs="Times New Roman" w:eastAsia="Times New Roman" w:hAnsi="Times New Roman"/>
-                <w:sz w:val="21"/>
-                <w:szCs w:val="21"/>
-              </w:rPr>
-              <w:t xml:space="preserve">"I'm curious about ____ because I've never ____."</w:t>
-            </w:r>
-          </w:p>
-          <w:p>
-            <w:pPr>
-              <w:spacing w:after="60"/>
-            </w:pPr>
-            <w:r>
-              <w:rPr>
-                <w:rFonts w:ascii="Times New Roman" w:cs="Times New Roman" w:eastAsia="Times New Roman" w:hAnsi="Times New Roman"/>
-                <w:sz w:val="21"/>
-                <w:szCs w:val="21"/>
-              </w:rPr>
-              <w:t xml:space="preserve">"This year I want to learn how to make/build ____ so that I can ____."</w:t>
-            </w:r>
-          </w:p>
-        </w:tc>
-      </w:tr>
-    </w:tbl>
-    <w:p>
-      <w:pPr>
-        <w:spacing w:after="200"/>
-      </w:pPr>
-    </w:p>
-    <w:tbl>
-      <w:tblPr>
-        <w:tblW w:type="pct" w:w="100%"/>
-        <w:tblBorders>
-          <w:top w:val="single" w:color="0070C0" w:sz="6"/>
-          <w:left w:val="single" w:color="0070C0" w:sz="6"/>
-          <w:bottom w:val="single" w:color="0070C0" w:sz="6"/>
-          <w:right w:val="single" w:color="0070C0" w:sz="6"/>
-          <w:insideH w:val="single" w:color="auto" w:sz="4"/>
-          <w:insideV w:val="single" w:color="auto" w:sz="4"/>
-        </w:tblBorders>
-      </w:tblPr>
-      <w:tblGrid>
-        <w:gridCol w:w="100"/>
-      </w:tblGrid>
-      <w:tr>
-        <w:tc>
-          <w:tcPr>
-            <w:shd w:fill="F2F2F2" w:color="auto" w:val="clear"/>
-            <w:tcMar>
-              <w:top w:type="dxa" w:w="120"/>
-              <w:left w:type="dxa" w:w="160"/>
-              <w:bottom w:type="dxa" w:w="120"/>
-              <w:right w:type="dxa" w:w="160"/>
-            </w:tcMar>
-          </w:tcPr>
-          <w:p>
-            <w:pPr>
-              <w:spacing w:after="80"/>
-            </w:pPr>
-            <w:r>
-              <w:rPr>
-                <w:rFonts w:ascii="Times New Roman" w:cs="Times New Roman" w:eastAsia="Times New Roman" w:hAnsi="Times New Roman"/>
-                <w:b/>
-                <w:bCs/>
-                <w:color w:val="0070C0"/>
-                <w:sz w:val="22"/>
-                <w:szCs w:val="22"/>
-              </w:rPr>
-              <w:t xml:space="preserve">Bonus (optional):</w:t>
-            </w:r>
-          </w:p>
-          <w:p>
-            <w:pPr>
-              <w:spacing w:after="60"/>
-            </w:pPr>
-            <w:r>
-              <w:rPr>
-                <w:rFonts w:ascii="Times New Roman" w:cs="Times New Roman" w:eastAsia="Times New Roman" w:hAnsi="Times New Roman"/>
-                <w:sz w:val="21"/>
-                <w:szCs w:val="21"/>
-              </w:rPr>
-              <w:t xml:space="preserve">4. How could the skills you learn in Design 1 connect to a career or interest you already have?</w:t>
-            </w:r>
-          </w:p>
-        </w:tc>
-      </w:tr>
-    </w:tbl>
+        <w:spacing w:after="500"/>
+      </w:pPr>
+    </w:p>
     <w:sectPr>
       <w:pgSz w:w="11906" w:h="16838" w:orient="portrait"/>
       <w:pgMar w:top="1440" w:right="1440" w:bottom="1440" w:left="1440" w:header="708" w:footer="708" w:gutter="0"/>

</xml_diff>